<commit_message>
Output quality pass: tighter summary, split bullets, hero fits, numbers agree
Co-Authored-By: Claude Opus 5 <noreply@anthropic.com>
</commit_message>
<xml_diff>
--- a/ariel/resume.docx
+++ b/ariel/resume.docx
@@ -60,9 +60,7 @@
           <w:sz w:val="21"/>
           <w:szCs w:val="21"/>
         </w:rPr>
-        <w:t xml:space="preserve">Linguist with global teaching experience and hands-on experience in the AI/LLM space from project initiation to production monitoring across a variety of multimodal project types, including workflows featuring links, imagery, and video content.
-Positive, problem-solving team leader and trainer who excels at identifying and resolving misunderstandings by fostering global team collaboration to achieve high-quality results.
-Quality Specialist who excels at analyzing project-wide data and maintaining living documentation to drive consistency across multilingual workflows.</w:t>
+        <w:t xml:space="preserve">Training Quality Manager with 9 years of experience spanning multilingual data annotation and LLM workflows. Built and maintained living documentation to drive consistency across multimodal projects involving links, imagery, and video. Seeking a role that applies quality systems to AI training pipelines.</w:t>
       </w:r>
     </w:p>
     <w:p>
@@ -265,7 +263,43 @@
           <w:sz w:val="21"/>
           <w:szCs w:val="21"/>
         </w:rPr>
-        <w:t xml:space="preserve">Supports client-driven short and long-term data annotation needs from project initiation to completion; Interprets nuanced guidance and communicates it to global, dispersed teams; Manages quality process to ensure output meets client needs, even in subjective spaces.</w:t>
+        <w:t xml:space="preserve">Supports client-driven short and long-term data annotation needs from project initiation to completion.</w:t>
+      </w:r>
+    </w:p>
+    <w:p>
+      <w:pPr>
+        <w:pStyle w:val="ListParagraph"/>
+        <w:numPr>
+          <w:ilvl w:val="0"/>
+          <w:numId w:val="2"/>
+        </w:numPr>
+        <w:spacing w:after="40"/>
+      </w:pPr>
+      <w:r>
+        <w:rPr>
+          <w:rFonts w:ascii="Calibri" w:cs="Calibri" w:eastAsia="Calibri" w:hAnsi="Calibri"/>
+          <w:sz w:val="21"/>
+          <w:szCs w:val="21"/>
+        </w:rPr>
+        <w:t xml:space="preserve">Interprets nuanced guidance and communicates it to global, dispersed teams.</w:t>
+      </w:r>
+    </w:p>
+    <w:p>
+      <w:pPr>
+        <w:pStyle w:val="ListParagraph"/>
+        <w:numPr>
+          <w:ilvl w:val="0"/>
+          <w:numId w:val="2"/>
+        </w:numPr>
+        <w:spacing w:after="40"/>
+      </w:pPr>
+      <w:r>
+        <w:rPr>
+          <w:rFonts w:ascii="Calibri" w:cs="Calibri" w:eastAsia="Calibri" w:hAnsi="Calibri"/>
+          <w:sz w:val="21"/>
+          <w:szCs w:val="21"/>
+        </w:rPr>
+        <w:t xml:space="preserve">Manages quality process to ensure output meets client needs, even in subjective spaces.</w:t>
       </w:r>
     </w:p>
     <w:p>
@@ -313,7 +347,43 @@
           <w:sz w:val="21"/>
           <w:szCs w:val="21"/>
         </w:rPr>
-        <w:t xml:space="preserve">Drove initial multilingual scaling from base EN, prioritizing alignment across languages to maintain and improve overall output quality; Interpreted client guidelines and shared localized insights with dispersed linguistic team to drive multilingual consistency across languages and cultures; Leveraged existing education expertise to facilitate initial training alignment and continuous improvement.</w:t>
+        <w:t xml:space="preserve">Drove initial multilingual scaling from base EN, prioritizing alignment across languages to maintain and improve overall output quality.</w:t>
+      </w:r>
+    </w:p>
+    <w:p>
+      <w:pPr>
+        <w:pStyle w:val="ListParagraph"/>
+        <w:numPr>
+          <w:ilvl w:val="0"/>
+          <w:numId w:val="2"/>
+        </w:numPr>
+        <w:spacing w:after="40"/>
+      </w:pPr>
+      <w:r>
+        <w:rPr>
+          <w:rFonts w:ascii="Calibri" w:cs="Calibri" w:eastAsia="Calibri" w:hAnsi="Calibri"/>
+          <w:sz w:val="21"/>
+          <w:szCs w:val="21"/>
+        </w:rPr>
+        <w:t xml:space="preserve">Interpreted client guidelines and shared localized insights with dispersed linguistic team to drive multilingual consistency across languages and cultures.</w:t>
+      </w:r>
+    </w:p>
+    <w:p>
+      <w:pPr>
+        <w:pStyle w:val="ListParagraph"/>
+        <w:numPr>
+          <w:ilvl w:val="0"/>
+          <w:numId w:val="2"/>
+        </w:numPr>
+        <w:spacing w:after="40"/>
+      </w:pPr>
+      <w:r>
+        <w:rPr>
+          <w:rFonts w:ascii="Calibri" w:cs="Calibri" w:eastAsia="Calibri" w:hAnsi="Calibri"/>
+          <w:sz w:val="21"/>
+          <w:szCs w:val="21"/>
+        </w:rPr>
+        <w:t xml:space="preserve">Leveraged existing education expertise to facilitate initial training alignment and continuous improvement.</w:t>
       </w:r>
     </w:p>
     <w:p>
@@ -396,24 +466,6 @@
     </w:p>
     <w:p>
       <w:pPr>
-        <w:pStyle w:val="ListParagraph"/>
-        <w:numPr>
-          <w:ilvl w:val="0"/>
-          <w:numId w:val="2"/>
-        </w:numPr>
-        <w:spacing w:after="40"/>
-      </w:pPr>
-      <w:r>
-        <w:rPr>
-          <w:rFonts w:ascii="Calibri" w:cs="Calibri" w:eastAsia="Calibri" w:hAnsi="Calibri"/>
-          <w:sz w:val="21"/>
-          <w:szCs w:val="21"/>
-        </w:rPr>
-        <w:t xml:space="preserve">Interprets project guidelines and updates; Analyzes produced data and identifies trends to recommend improvements; Facilitates project cycle including training development and audits; Collaborates with global team to uphold client-specified standards.</w:t>
-      </w:r>
-    </w:p>
-    <w:p>
-      <w:pPr>
         <w:tabs>
           <w:tab w:val="right" w:pos="10224"/>
         </w:tabs>
@@ -440,24 +492,6 @@
           <w:szCs w:val="17"/>
         </w:rPr>
         <w:t xml:space="preserve">Jul 2023 → Dec 2023</w:t>
-      </w:r>
-    </w:p>
-    <w:p>
-      <w:pPr>
-        <w:pStyle w:val="ListParagraph"/>
-        <w:numPr>
-          <w:ilvl w:val="0"/>
-          <w:numId w:val="2"/>
-        </w:numPr>
-        <w:spacing w:after="40"/>
-      </w:pPr>
-      <w:r>
-        <w:rPr>
-          <w:rFonts w:ascii="Calibri" w:cs="Calibri" w:eastAsia="Calibri" w:hAnsi="Calibri"/>
-          <w:sz w:val="21"/>
-          <w:szCs w:val="21"/>
-        </w:rPr>
-        <w:t xml:space="preserve">Created training data sets for AI models to improve quality; Collaborated with a distributed team to refine and iterate LLM specifications; Conducted research and made recommendations to client.</w:t>
       </w:r>
     </w:p>
     <w:p>
@@ -555,7 +589,25 @@
           <w:sz w:val="21"/>
           <w:szCs w:val="21"/>
         </w:rPr>
-        <w:t xml:space="preserve">Conducted daily research to verify and enrich output; Documented and communicated data-driven insights across distributed team.</w:t>
+        <w:t xml:space="preserve">Conducted daily research to verify and enrich output.</w:t>
+      </w:r>
+    </w:p>
+    <w:p>
+      <w:pPr>
+        <w:pStyle w:val="ListParagraph"/>
+        <w:numPr>
+          <w:ilvl w:val="0"/>
+          <w:numId w:val="2"/>
+        </w:numPr>
+        <w:spacing w:after="40"/>
+      </w:pPr>
+      <w:r>
+        <w:rPr>
+          <w:rFonts w:ascii="Calibri" w:cs="Calibri" w:eastAsia="Calibri" w:hAnsi="Calibri"/>
+          <w:sz w:val="21"/>
+          <w:szCs w:val="21"/>
+        </w:rPr>
+        <w:t xml:space="preserve">Documented and communicated data-driven insights across distributed team.</w:t>
       </w:r>
     </w:p>
     <w:p>
@@ -921,7 +973,7 @@
           <w:sz w:val="21"/>
           <w:szCs w:val="21"/>
         </w:rPr>
-        <w:t xml:space="preserve">Spearheaded a unique project to rewrite training materials, resulting in accelerated learning and enhanced performance through the implementation of structured, performance-driven content</w:t>
+        <w:t xml:space="preserve">Rewrote training materials, implementing structured, performance-driven content.</w:t>
       </w:r>
     </w:p>
     <w:p>
@@ -986,8 +1038,8 @@
           <w:rFonts w:ascii="Calibri" w:cs="Calibri" w:eastAsia="Calibri" w:hAnsi="Calibri"/>
           <w:b/>
           <w:bCs/>
-          <w:sz w:val="24"/>
-          <w:szCs w:val="24"/>
+          <w:sz w:val="22"/>
+          <w:szCs w:val="22"/>
         </w:rPr>
         <w:t xml:space="preserve">Linguist</w:t>
       </w:r>
@@ -1019,7 +1071,25 @@
           <w:sz w:val="21"/>
           <w:szCs w:val="21"/>
         </w:rPr>
-        <w:t xml:space="preserve">Annotated utterances using an ever-adapting semantic labelling system; worked on Natural Language Generation and Natural Language Production teams on a variety of project types.</w:t>
+        <w:t xml:space="preserve">Annotated utterances using an ever-adapting semantic labelling system.</w:t>
+      </w:r>
+    </w:p>
+    <w:p>
+      <w:pPr>
+        <w:pStyle w:val="ListParagraph"/>
+        <w:numPr>
+          <w:ilvl w:val="0"/>
+          <w:numId w:val="2"/>
+        </w:numPr>
+        <w:spacing w:after="40"/>
+      </w:pPr>
+      <w:r>
+        <w:rPr>
+          <w:rFonts w:ascii="Calibri" w:cs="Calibri" w:eastAsia="Calibri" w:hAnsi="Calibri"/>
+          <w:sz w:val="21"/>
+          <w:szCs w:val="21"/>
+        </w:rPr>
+        <w:t xml:space="preserve">Worked on Natural Language Generation and Natural Language Production teams across multiple project types.</w:t>
       </w:r>
     </w:p>
     <w:p>
@@ -1099,7 +1169,25 @@
           <w:sz w:val="21"/>
           <w:szCs w:val="21"/>
         </w:rPr>
-        <w:t xml:space="preserve">Created interactive content to foster asynchronous learning; Created and implemented engaging virtual classroom activities; Analyzed teacher and student feedback data and modified content to improve existing materials.</w:t>
+        <w:t xml:space="preserve">Created interactive content to foster asynchronous learning.</w:t>
+      </w:r>
+    </w:p>
+    <w:p>
+      <w:pPr>
+        <w:pStyle w:val="ListParagraph"/>
+        <w:numPr>
+          <w:ilvl w:val="0"/>
+          <w:numId w:val="2"/>
+        </w:numPr>
+        <w:spacing w:after="40"/>
+      </w:pPr>
+      <w:r>
+        <w:rPr>
+          <w:rFonts w:ascii="Calibri" w:cs="Calibri" w:eastAsia="Calibri" w:hAnsi="Calibri"/>
+          <w:sz w:val="21"/>
+          <w:szCs w:val="21"/>
+        </w:rPr>
+        <w:t xml:space="preserve">Created and implemented engaging virtual classroom activities.</w:t>
       </w:r>
     </w:p>
     <w:p>
@@ -1131,7 +1219,7 @@
           <w:sz w:val="17"/>
           <w:szCs w:val="17"/>
         </w:rPr>
-        <w:t xml:space="preserve">Nov 2017 → Jan 2022</w:t>
+        <w:t xml:space="preserve">Nov 2018 → Jan 2022</w:t>
       </w:r>
     </w:p>
     <w:p>
@@ -1202,22 +1290,48 @@
     </w:p>
     <w:p>
       <w:pPr>
-        <w:tabs>
-          <w:tab w:val="right" w:pos="10224"/>
-        </w:tabs>
-        <w:spacing w:after="20" w:before="140"/>
-      </w:pPr>
-      <w:r>
-        <w:rPr>
-          <w:rFonts w:ascii="Calibri" w:cs="Calibri" w:eastAsia="Calibri" w:hAnsi="Calibri"/>
-          <w:b/>
-          <w:bCs/>
-          <w:sz w:val="22"/>
-          <w:szCs w:val="22"/>
+        <w:spacing w:after="40" w:before="180"/>
+      </w:pPr>
+      <w:r>
+        <w:rPr>
+          <w:rFonts w:ascii="Calibri" w:cs="Calibri" w:eastAsia="Calibri" w:hAnsi="Calibri"/>
+          <w:b/>
+          <w:bCs/>
+          <w:color w:val="6B625A"/>
+          <w:spacing w:val="20"/>
+          <w:sz w:val="17"/>
+          <w:szCs w:val="17"/>
+        </w:rPr>
+        <w:t xml:space="preserve">EARLIER</w:t>
+      </w:r>
+    </w:p>
+    <w:p>
+      <w:pPr>
+        <w:tabs>
+          <w:tab w:val="right" w:pos="10224"/>
+        </w:tabs>
+        <w:spacing w:after="20"/>
+      </w:pPr>
+      <w:r>
+        <w:rPr>
+          <w:rFonts w:ascii="Calibri" w:cs="Calibri" w:eastAsia="Calibri" w:hAnsi="Calibri"/>
+          <w:b/>
+          <w:bCs/>
+          <w:sz w:val="20"/>
+          <w:szCs w:val="20"/>
         </w:rPr>
         <w:t xml:space="preserve">Project Manager</w:t>
       </w:r>
       <w:r>
+        <w:rPr>
+          <w:rFonts w:ascii="Calibri" w:cs="Calibri" w:eastAsia="Calibri" w:hAnsi="Calibri"/>
+          <w:color w:val="6B625A"/>
+          <w:sz w:val="20"/>
+          <w:szCs w:val="20"/>
+        </w:rPr>
+        <w:t xml:space="preserve">  ·  ICON PLC</w:t>
+      </w:r>
+      <w:r>
         <w:t xml:space="preserve">	</w:t>
       </w:r>
       <w:r>
@@ -1232,58 +1346,29 @@
     </w:p>
     <w:p>
       <w:pPr>
-        <w:pStyle w:val="ListParagraph"/>
-        <w:numPr>
-          <w:ilvl w:val="0"/>
-          <w:numId w:val="2"/>
-        </w:numPr>
-        <w:spacing w:after="40"/>
-      </w:pPr>
-      <w:r>
-        <w:rPr>
-          <w:rFonts w:ascii="Calibri" w:cs="Calibri" w:eastAsia="Calibri" w:hAnsi="Calibri"/>
-          <w:sz w:val="21"/>
-          <w:szCs w:val="21"/>
-        </w:rPr>
-        <w:t xml:space="preserve">Managed complex translation projects within tight time and budget constraints, ensuring timely delivery and cost-effectiveness while maintaining quality goals as defined with the medical context.</w:t>
-      </w:r>
-    </w:p>
-    <w:p>
-      <w:pPr>
-        <w:pStyle w:val="ListParagraph"/>
-        <w:numPr>
-          <w:ilvl w:val="0"/>
-          <w:numId w:val="2"/>
-        </w:numPr>
-        <w:spacing w:after="40"/>
-      </w:pPr>
-      <w:r>
-        <w:rPr>
-          <w:rFonts w:ascii="Calibri" w:cs="Calibri" w:eastAsia="Calibri" w:hAnsi="Calibri"/>
-          <w:sz w:val="21"/>
-          <w:szCs w:val="21"/>
-        </w:rPr>
-        <w:t xml:space="preserve">Conducted meticulous evaluations of technical documents and CAT tools, optimizing efficiency and accuracy</w:t>
-      </w:r>
-    </w:p>
-    <w:p>
-      <w:pPr>
-        <w:tabs>
-          <w:tab w:val="right" w:pos="10224"/>
-        </w:tabs>
-        <w:spacing w:after="0" w:before="200"/>
-      </w:pPr>
-      <w:r>
-        <w:rPr>
-          <w:rFonts w:ascii="Calibri" w:cs="Calibri" w:eastAsia="Calibri" w:hAnsi="Calibri"/>
-          <w:b/>
-          <w:bCs/>
-          <w:color w:val="6B625A"/>
-          <w:spacing w:val="16"/>
-          <w:sz w:val="19"/>
-          <w:szCs w:val="19"/>
-        </w:rPr>
-        <w:t xml:space="preserve">KUWAIT AMERICAN SCHOOL</w:t>
+        <w:tabs>
+          <w:tab w:val="right" w:pos="10224"/>
+        </w:tabs>
+        <w:spacing w:after="20"/>
+      </w:pPr>
+      <w:r>
+        <w:rPr>
+          <w:rFonts w:ascii="Calibri" w:cs="Calibri" w:eastAsia="Calibri" w:hAnsi="Calibri"/>
+          <w:b/>
+          <w:bCs/>
+          <w:sz w:val="20"/>
+          <w:szCs w:val="20"/>
+        </w:rPr>
+        <w:t xml:space="preserve">Fourth Grade Teacher</w:t>
+      </w:r>
+      <w:r>
+        <w:rPr>
+          <w:rFonts w:ascii="Calibri" w:cs="Calibri" w:eastAsia="Calibri" w:hAnsi="Calibri"/>
+          <w:color w:val="6B625A"/>
+          <w:sz w:val="20"/>
+          <w:szCs w:val="20"/>
+        </w:rPr>
+        <w:t xml:space="preserve">  ·  Kuwait American School</w:t>
       </w:r>
       <w:r>
         <w:t xml:space="preserve">	</w:t>
@@ -1303,89 +1388,6 @@
         <w:tabs>
           <w:tab w:val="right" w:pos="10224"/>
         </w:tabs>
-        <w:spacing w:after="20" w:before="140"/>
-      </w:pPr>
-      <w:r>
-        <w:rPr>
-          <w:rFonts w:ascii="Calibri" w:cs="Calibri" w:eastAsia="Calibri" w:hAnsi="Calibri"/>
-          <w:b/>
-          <w:bCs/>
-          <w:sz w:val="22"/>
-          <w:szCs w:val="22"/>
-        </w:rPr>
-        <w:t xml:space="preserve">Fourth Grade Teacher</w:t>
-      </w:r>
-      <w:r>
-        <w:t xml:space="preserve">	</w:t>
-      </w:r>
-      <w:r>
-        <w:rPr>
-          <w:rFonts w:ascii="Calibri" w:cs="Calibri" w:eastAsia="Calibri" w:hAnsi="Calibri"/>
-          <w:color w:val="6B625A"/>
-          <w:sz w:val="17"/>
-          <w:szCs w:val="17"/>
-        </w:rPr>
-        <w:t xml:space="preserve">Sep 2016 → Jun 2017</w:t>
-      </w:r>
-    </w:p>
-    <w:p>
-      <w:pPr>
-        <w:pStyle w:val="ListParagraph"/>
-        <w:numPr>
-          <w:ilvl w:val="0"/>
-          <w:numId w:val="2"/>
-        </w:numPr>
-        <w:spacing w:after="40"/>
-      </w:pPr>
-      <w:r>
-        <w:rPr>
-          <w:rFonts w:ascii="Calibri" w:cs="Calibri" w:eastAsia="Calibri" w:hAnsi="Calibri"/>
-          <w:sz w:val="21"/>
-          <w:szCs w:val="21"/>
-        </w:rPr>
-        <w:t xml:space="preserve">Developed and implemented blended learning curricula and testing materials for core subjects (Math, Social Studies, Language Arts, Science) for a fourth-grade class in an International School.</w:t>
-      </w:r>
-    </w:p>
-    <w:p>
-      <w:pPr>
-        <w:pStyle w:val="ListParagraph"/>
-        <w:numPr>
-          <w:ilvl w:val="0"/>
-          <w:numId w:val="2"/>
-        </w:numPr>
-        <w:spacing w:after="40"/>
-      </w:pPr>
-      <w:r>
-        <w:rPr>
-          <w:rFonts w:ascii="Calibri" w:cs="Calibri" w:eastAsia="Calibri" w:hAnsi="Calibri"/>
-          <w:sz w:val="21"/>
-          <w:szCs w:val="21"/>
-        </w:rPr>
-        <w:t xml:space="preserve">Created and executed classroom curricula and testing materials for core subjects; Nurtured a positive learning environment for all learning types; Taught extra-curricular speech and debate.</w:t>
-      </w:r>
-    </w:p>
-    <w:p>
-      <w:pPr>
-        <w:spacing w:after="40" w:before="180"/>
-      </w:pPr>
-      <w:r>
-        <w:rPr>
-          <w:rFonts w:ascii="Calibri" w:cs="Calibri" w:eastAsia="Calibri" w:hAnsi="Calibri"/>
-          <w:b/>
-          <w:bCs/>
-          <w:color w:val="6B625A"/>
-          <w:spacing w:val="20"/>
-          <w:sz w:val="17"/>
-          <w:szCs w:val="17"/>
-        </w:rPr>
-        <w:t xml:space="preserve">EARLIER</w:t>
-      </w:r>
-    </w:p>
-    <w:p>
-      <w:pPr>
-        <w:tabs>
-          <w:tab w:val="right" w:pos="10224"/>
-        </w:tabs>
         <w:spacing w:after="20"/>
       </w:pPr>
       <w:r>
@@ -1435,7 +1437,7 @@
           <w:sz w:val="20"/>
           <w:szCs w:val="20"/>
         </w:rPr>
-        <w:t xml:space="preserve">English Teacher / Language Assistant</w:t>
+        <w:t xml:space="preserve">English Teacher</w:t>
       </w:r>
       <w:r>
         <w:rPr>
@@ -1643,7 +1645,7 @@
           <w:sz w:val="20"/>
           <w:szCs w:val="20"/>
         </w:rPr>
-        <w:t xml:space="preserve">MIT Professional Education</w:t>
+        <w:t xml:space="preserve">MIT Professional Education Program</w:t>
       </w:r>
     </w:p>
     <w:p>
@@ -1766,7 +1768,7 @@
           <w:sz w:val="20"/>
           <w:szCs w:val="20"/>
         </w:rPr>
-        <w:t xml:space="preserve">  ·  2022</w:t>
+        <w:t xml:space="preserve">  ·  Summ</w:t>
       </w:r>
     </w:p>
     <w:p>

</xml_diff>